<commit_message>
mudei template residecia nova
</commit_message>
<xml_diff>
--- a/resources/templates/residencianovo.docx
+++ b/resources/templates/residencianovo.docx
@@ -16,7 +16,7 @@
         <mc:AlternateContent>
           <mc:Choice Requires="wps">
             <w:drawing>
-              <wp:anchor distT="0" distB="0" distL="0" distR="0" simplePos="0" relativeHeight="251654144" behindDoc="0" locked="0" layoutInCell="1" allowOverlap="1" wp14:anchorId="0F89533D" wp14:editId="073E8BF9">
+              <wp:anchor distT="0" distB="0" distL="0" distR="0" simplePos="0" relativeHeight="251653120" behindDoc="0" locked="0" layoutInCell="1" allowOverlap="1" wp14:anchorId="0F89533D" wp14:editId="073E8BF9">
                 <wp:simplePos x="0" y="0"/>
                 <wp:positionH relativeFrom="column">
                   <wp:posOffset>47708</wp:posOffset>
@@ -90,7 +90,7 @@
           </mc:Choice>
           <mc:Fallback>
             <w:pict>
-              <v:rect w14:anchorId="0F89533D" id="Shape1_0" o:spid="_x0000_s1026" style="position:absolute;margin-left:3.75pt;margin-top:53.2pt;width:432.15pt;height:13.2pt;z-index:251654144;visibility:visible;mso-wrap-style:square;mso-width-percent:0;mso-height-percent:0;mso-wrap-distance-left:0;mso-wrap-distance-top:0;mso-wrap-distance-right:0;mso-wrap-distance-bottom:0;mso-position-horizontal:absolute;mso-position-horizontal-relative:text;mso-position-vertical:absolute;mso-position-vertical-relative:text;mso-width-percent:0;mso-height-percent:0;mso-width-relative:margin;mso-height-relative:margin;v-text-anchor:top" o:gfxdata="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" filled="f" stroked="f">
+              <v:rect w14:anchorId="0F89533D" id="Shape1_0" o:spid="_x0000_s1026" style="position:absolute;margin-left:3.75pt;margin-top:53.2pt;width:432.15pt;height:13.2pt;z-index:251653120;visibility:visible;mso-wrap-style:square;mso-width-percent:0;mso-height-percent:0;mso-wrap-distance-left:0;mso-wrap-distance-top:0;mso-wrap-distance-right:0;mso-wrap-distance-bottom:0;mso-position-horizontal:absolute;mso-position-horizontal-relative:text;mso-position-vertical:absolute;mso-position-vertical-relative:text;mso-width-percent:0;mso-height-percent:0;mso-width-relative:margin;mso-height-relative:margin;v-text-anchor:top" o:gfxdata="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" filled="f" stroked="f">
                 <v:textbox inset="0,0,0,0">
                   <w:txbxContent>
                     <w:p>
@@ -118,7 +118,7 @@
         <mc:AlternateContent>
           <mc:Choice Requires="wps">
             <w:drawing>
-              <wp:anchor distT="0" distB="0" distL="0" distR="0" simplePos="0" relativeHeight="251657216" behindDoc="0" locked="0" layoutInCell="1" allowOverlap="1" wp14:anchorId="50A4A980" wp14:editId="77E71A63">
+              <wp:anchor distT="0" distB="0" distL="0" distR="0" simplePos="0" relativeHeight="251658240" behindDoc="0" locked="0" layoutInCell="1" allowOverlap="1" wp14:anchorId="50A4A980" wp14:editId="77E71A63">
                 <wp:simplePos x="0" y="0"/>
                 <wp:positionH relativeFrom="column">
                   <wp:posOffset>1953089</wp:posOffset>
@@ -198,7 +198,7 @@
           </mc:Choice>
           <mc:Fallback>
             <w:pict>
-              <v:rect w14:anchorId="50A4A980" id="Shape1_15" o:spid="_x0000_s1027" style="position:absolute;margin-left:153.8pt;margin-top:485pt;width:57.5pt;height:12.15pt;z-index:251657216;visibility:visible;mso-wrap-style:square;mso-width-percent:0;mso-height-percent:0;mso-wrap-distance-left:0;mso-wrap-distance-top:0;mso-wrap-distance-right:0;mso-wrap-distance-bottom:0;mso-position-horizontal:absolute;mso-position-horizontal-relative:text;mso-position-vertical:absolute;mso-position-vertical-relative:text;mso-width-percent:0;mso-height-percent:0;mso-width-relative:margin;mso-height-relative:margin;v-text-anchor:top" o:gfxdata="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" filled="f" stroked="f">
+              <v:rect w14:anchorId="50A4A980" id="Shape1_15" o:spid="_x0000_s1027" style="position:absolute;margin-left:153.8pt;margin-top:485pt;width:57.5pt;height:12.15pt;z-index:251658240;visibility:visible;mso-wrap-style:square;mso-width-percent:0;mso-height-percent:0;mso-wrap-distance-left:0;mso-wrap-distance-top:0;mso-wrap-distance-right:0;mso-wrap-distance-bottom:0;mso-position-horizontal:absolute;mso-position-horizontal-relative:text;mso-position-vertical:absolute;mso-position-vertical-relative:text;mso-width-percent:0;mso-height-percent:0;mso-width-relative:margin;mso-height-relative:margin;v-text-anchor:top" o:gfxdata="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" filled="f" stroked="f">
                 <v:textbox inset="0,0,0,0">
                   <w:txbxContent>
                     <w:p>
@@ -232,7 +232,7 @@
         <mc:AlternateContent>
           <mc:Choice Requires="wps">
             <w:drawing>
-              <wp:anchor distT="0" distB="0" distL="0" distR="0" simplePos="0" relativeHeight="251664384" behindDoc="0" locked="0" layoutInCell="1" allowOverlap="1" wp14:anchorId="6EAD77A0" wp14:editId="29178120">
+              <wp:anchor distT="0" distB="0" distL="0" distR="0" simplePos="0" relativeHeight="251663360" behindDoc="0" locked="0" layoutInCell="1" allowOverlap="1" wp14:anchorId="6EAD77A0" wp14:editId="29178120">
                 <wp:simplePos x="0" y="0"/>
                 <wp:positionH relativeFrom="column">
                   <wp:posOffset>4558030</wp:posOffset>
@@ -300,7 +300,7 @@
           </mc:Choice>
           <mc:Fallback>
             <w:pict>
-              <v:rect w14:anchorId="6EAD77A0" id="Shape1_17" o:spid="_x0000_s1028" style="position:absolute;margin-left:358.9pt;margin-top:485.25pt;width:77.95pt;height:12.6pt;z-index:251664384;visibility:visible;mso-wrap-style:square;mso-wrap-distance-left:0;mso-wrap-distance-top:0;mso-wrap-distance-right:0;mso-wrap-distance-bottom:0;mso-position-horizontal:absolute;mso-position-horizontal-relative:text;mso-position-vertical:absolute;mso-position-vertical-relative:text;v-text-anchor:top" o:gfxdata="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" filled="f" stroked="f">
+              <v:rect w14:anchorId="6EAD77A0" id="Shape1_17" o:spid="_x0000_s1028" style="position:absolute;margin-left:358.9pt;margin-top:485.25pt;width:77.95pt;height:12.6pt;z-index:251663360;visibility:visible;mso-wrap-style:square;mso-wrap-distance-left:0;mso-wrap-distance-top:0;mso-wrap-distance-right:0;mso-wrap-distance-bottom:0;mso-position-horizontal:absolute;mso-position-horizontal-relative:text;mso-position-vertical:absolute;mso-position-vertical-relative:text;v-text-anchor:top" o:gfxdata="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" filled="f" stroked="f">
                 <v:textbox style="mso-fit-shape-to-text:t" inset="0,0,0,0">
                   <w:txbxContent>
                     <w:p>
@@ -328,7 +328,7 @@
         <mc:AlternateContent>
           <mc:Choice Requires="wps">
             <w:drawing>
-              <wp:anchor distT="0" distB="0" distL="0" distR="0" simplePos="0" relativeHeight="251662336" behindDoc="0" locked="0" layoutInCell="1" allowOverlap="1" wp14:anchorId="2FDAD5B4" wp14:editId="04883761">
+              <wp:anchor distT="0" distB="0" distL="0" distR="0" simplePos="0" relativeHeight="251661312" behindDoc="0" locked="0" layoutInCell="1" allowOverlap="1" wp14:anchorId="2FDAD5B4" wp14:editId="04883761">
                 <wp:simplePos x="0" y="0"/>
                 <wp:positionH relativeFrom="column">
                   <wp:posOffset>3029585</wp:posOffset>
@@ -396,7 +396,7 @@
           </mc:Choice>
           <mc:Fallback>
             <w:pict>
-              <v:rect w14:anchorId="2FDAD5B4" id="Shape1_16" o:spid="_x0000_s1029" style="position:absolute;margin-left:238.55pt;margin-top:486.15pt;width:117.3pt;height:12.6pt;z-index:251662336;visibility:visible;mso-wrap-style:square;mso-wrap-distance-left:0;mso-wrap-distance-top:0;mso-wrap-distance-right:0;mso-wrap-distance-bottom:0;mso-position-horizontal:absolute;mso-position-horizontal-relative:text;mso-position-vertical:absolute;mso-position-vertical-relative:text;v-text-anchor:top" o:gfxdata="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" filled="f" stroked="f">
+              <v:rect w14:anchorId="2FDAD5B4" id="Shape1_16" o:spid="_x0000_s1029" style="position:absolute;margin-left:238.55pt;margin-top:486.15pt;width:117.3pt;height:12.6pt;z-index:251661312;visibility:visible;mso-wrap-style:square;mso-wrap-distance-left:0;mso-wrap-distance-top:0;mso-wrap-distance-right:0;mso-wrap-distance-bottom:0;mso-position-horizontal:absolute;mso-position-horizontal-relative:text;mso-position-vertical:absolute;mso-position-vertical-relative:text;v-text-anchor:top" o:gfxdata="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" filled="f" stroked="f">
                 <v:textbox style="mso-fit-shape-to-text:t" inset="0,0,0,0">
                   <w:txbxContent>
                     <w:p>
@@ -424,7 +424,7 @@
         <mc:AlternateContent>
           <mc:Choice Requires="wps">
             <w:drawing>
-              <wp:anchor distT="0" distB="0" distL="0" distR="0" simplePos="0" relativeHeight="251656192" behindDoc="0" locked="0" layoutInCell="1" allowOverlap="1" wp14:anchorId="329715BA" wp14:editId="672F611B">
+              <wp:anchor distT="0" distB="0" distL="0" distR="0" simplePos="0" relativeHeight="251655168" behindDoc="0" locked="0" layoutInCell="1" allowOverlap="1" wp14:anchorId="329715BA" wp14:editId="672F611B">
                 <wp:simplePos x="0" y="0"/>
                 <wp:positionH relativeFrom="column">
                   <wp:posOffset>3580130</wp:posOffset>
@@ -495,7 +495,7 @@
           </mc:Choice>
           <mc:Fallback>
             <w:pict>
-              <v:rect w14:anchorId="329715BA" id="Shape1_3" o:spid="_x0000_s1030" style="position:absolute;margin-left:281.9pt;margin-top:77.4pt;width:139.85pt;height:12.6pt;z-index:251656192;visibility:visible;mso-wrap-style:square;mso-width-percent:0;mso-wrap-distance-left:0;mso-wrap-distance-top:0;mso-wrap-distance-right:0;mso-wrap-distance-bottom:0;mso-position-horizontal:absolute;mso-position-horizontal-relative:text;mso-position-vertical:absolute;mso-position-vertical-relative:text;mso-width-percent:0;mso-width-relative:margin;v-text-anchor:top" o:gfxdata="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" filled="f" stroked="f">
+              <v:rect w14:anchorId="329715BA" id="Shape1_3" o:spid="_x0000_s1030" style="position:absolute;margin-left:281.9pt;margin-top:77.4pt;width:139.85pt;height:12.6pt;z-index:251655168;visibility:visible;mso-wrap-style:square;mso-width-percent:0;mso-wrap-distance-left:0;mso-wrap-distance-top:0;mso-wrap-distance-right:0;mso-wrap-distance-bottom:0;mso-position-horizontal:absolute;mso-position-horizontal-relative:text;mso-position-vertical:absolute;mso-position-vertical-relative:text;mso-width-percent:0;mso-width-relative:margin;v-text-anchor:top" o:gfxdata="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" filled="f" stroked="f">
                 <v:textbox style="mso-fit-shape-to-text:t" inset="0,0,0,0">
                   <w:txbxContent>
                     <w:p>
@@ -523,7 +523,7 @@
         <mc:AlternateContent>
           <mc:Choice Requires="wps">
             <w:drawing>
-              <wp:anchor distT="0" distB="0" distL="0" distR="0" simplePos="0" relativeHeight="251660288" behindDoc="0" locked="0" layoutInCell="1" allowOverlap="1" wp14:anchorId="30CC3611" wp14:editId="2542E7C5">
+              <wp:anchor distT="0" distB="0" distL="0" distR="0" simplePos="0" relativeHeight="251659264" behindDoc="0" locked="0" layoutInCell="1" allowOverlap="1" wp14:anchorId="30CC3611" wp14:editId="2542E7C5">
                 <wp:simplePos x="0" y="0"/>
                 <wp:positionH relativeFrom="column">
                   <wp:posOffset>457835</wp:posOffset>
@@ -591,7 +591,7 @@
           </mc:Choice>
           <mc:Fallback>
             <w:pict>
-              <v:rect w14:anchorId="30CC3611" id="Shape1_8" o:spid="_x0000_s1031" style="position:absolute;margin-left:36.05pt;margin-top:203.9pt;width:141.25pt;height:12.6pt;z-index:251660288;visibility:visible;mso-wrap-style:square;mso-wrap-distance-left:0;mso-wrap-distance-top:0;mso-wrap-distance-right:0;mso-wrap-distance-bottom:0;mso-position-horizontal:absolute;mso-position-horizontal-relative:text;mso-position-vertical:absolute;mso-position-vertical-relative:text;v-text-anchor:top" o:gfxdata="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" filled="f" stroked="f">
+              <v:rect w14:anchorId="30CC3611" id="Shape1_8" o:spid="_x0000_s1031" style="position:absolute;margin-left:36.05pt;margin-top:203.9pt;width:141.25pt;height:12.6pt;z-index:251659264;visibility:visible;mso-wrap-style:square;mso-wrap-distance-left:0;mso-wrap-distance-top:0;mso-wrap-distance-right:0;mso-wrap-distance-bottom:0;mso-position-horizontal:absolute;mso-position-horizontal-relative:text;mso-position-vertical:absolute;mso-position-vertical-relative:text;v-text-anchor:top" o:gfxdata="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" filled="f" stroked="f">
                 <v:textbox style="mso-fit-shape-to-text:t" inset="0,0,0,0">
                   <w:txbxContent>
                     <w:p>
@@ -619,7 +619,7 @@
         <mc:AlternateContent>
           <mc:Choice Requires="wps">
             <w:drawing>
-              <wp:anchor distT="0" distB="0" distL="0" distR="0" simplePos="0" relativeHeight="251652096" behindDoc="0" locked="0" layoutInCell="1" allowOverlap="1" wp14:anchorId="12C22FE2" wp14:editId="0FA01BFF">
+              <wp:anchor distT="0" distB="0" distL="0" distR="0" simplePos="0" relativeHeight="251650048" behindDoc="0" locked="0" layoutInCell="1" allowOverlap="1" wp14:anchorId="12C22FE2" wp14:editId="0FA01BFF">
                 <wp:simplePos x="0" y="0"/>
                 <wp:positionH relativeFrom="column">
                   <wp:posOffset>34925</wp:posOffset>
@@ -681,7 +681,7 @@
           </mc:Choice>
           <mc:Fallback>
             <w:pict>
-              <v:rect w14:anchorId="12C22FE2" id="Shape1" o:spid="_x0000_s1032" style="position:absolute;margin-left:2.75pt;margin-top:55.35pt;width:421.5pt;height:12.6pt;z-index:251652096;visibility:visible;mso-wrap-style:square;mso-wrap-distance-left:0;mso-wrap-distance-top:0;mso-wrap-distance-right:0;mso-wrap-distance-bottom:0;mso-position-horizontal:absolute;mso-position-horizontal-relative:text;mso-position-vertical:absolute;mso-position-vertical-relative:text;v-text-anchor:top" o:gfxdata="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" filled="f" stroked="f">
+              <v:rect w14:anchorId="12C22FE2" id="Shape1" o:spid="_x0000_s1032" style="position:absolute;margin-left:2.75pt;margin-top:55.35pt;width:421.5pt;height:12.6pt;z-index:251650048;visibility:visible;mso-wrap-style:square;mso-wrap-distance-left:0;mso-wrap-distance-top:0;mso-wrap-distance-right:0;mso-wrap-distance-bottom:0;mso-position-horizontal:absolute;mso-position-horizontal-relative:text;mso-position-vertical:absolute;mso-position-vertical-relative:text;v-text-anchor:top" o:gfxdata="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" filled="f" stroked="f">
                 <v:textbox style="mso-fit-shape-to-text:t" inset="0,0,0,0">
                   <w:txbxContent>
                     <w:p>
@@ -703,7 +703,7 @@
         <mc:AlternateContent>
           <mc:Choice Requires="wps">
             <w:drawing>
-              <wp:anchor distT="0" distB="0" distL="0" distR="0" simplePos="0" relativeHeight="251651072" behindDoc="0" locked="0" layoutInCell="1" allowOverlap="1" wp14:anchorId="337914FB" wp14:editId="52EB4A73">
+              <wp:anchor distT="0" distB="0" distL="0" distR="0" simplePos="0" relativeHeight="251649024" behindDoc="0" locked="0" layoutInCell="1" allowOverlap="1" wp14:anchorId="337914FB" wp14:editId="52EB4A73">
                 <wp:simplePos x="0" y="0"/>
                 <wp:positionH relativeFrom="column">
                   <wp:posOffset>945515</wp:posOffset>
@@ -771,7 +771,7 @@
           </mc:Choice>
           <mc:Fallback>
             <w:pict>
-              <v:rect w14:anchorId="337914FB" id="Shape1_1" o:spid="_x0000_s1033" style="position:absolute;margin-left:74.45pt;margin-top:77.85pt;width:141.25pt;height:12.6pt;z-index:251651072;visibility:visible;mso-wrap-style:square;mso-wrap-distance-left:0;mso-wrap-distance-top:0;mso-wrap-distance-right:0;mso-wrap-distance-bottom:0;mso-position-horizontal:absolute;mso-position-horizontal-relative:text;mso-position-vertical:absolute;mso-position-vertical-relative:text;v-text-anchor:top" o:gfxdata="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" filled="f" stroked="f">
+              <v:rect w14:anchorId="337914FB" id="Shape1_1" o:spid="_x0000_s1033" style="position:absolute;margin-left:74.45pt;margin-top:77.85pt;width:141.25pt;height:12.6pt;z-index:251649024;visibility:visible;mso-wrap-style:square;mso-wrap-distance-left:0;mso-wrap-distance-top:0;mso-wrap-distance-right:0;mso-wrap-distance-bottom:0;mso-position-horizontal:absolute;mso-position-horizontal-relative:text;mso-position-vertical:absolute;mso-position-vertical-relative:text;v-text-anchor:top" o:gfxdata="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" filled="f" stroked="f">
                 <v:textbox style="mso-fit-shape-to-text:t" inset="0,0,0,0">
                   <w:txbxContent>
                     <w:p>
@@ -799,7 +799,7 @@
         <mc:AlternateContent>
           <mc:Choice Requires="wps">
             <w:drawing>
-              <wp:anchor distT="0" distB="0" distL="0" distR="0" simplePos="0" relativeHeight="251652096" behindDoc="0" locked="0" layoutInCell="1" allowOverlap="1" wp14:anchorId="6EB58B66" wp14:editId="45B1A929">
+              <wp:anchor distT="0" distB="0" distL="0" distR="0" simplePos="0" relativeHeight="251651072" behindDoc="0" locked="0" layoutInCell="1" allowOverlap="1" wp14:anchorId="6EB58B66" wp14:editId="45B1A929">
                 <wp:simplePos x="0" y="0"/>
                 <wp:positionH relativeFrom="column">
                   <wp:posOffset>624840</wp:posOffset>
@@ -879,7 +879,7 @@
           </mc:Choice>
           <mc:Fallback>
             <w:pict>
-              <v:rect w14:anchorId="6EB58B66" id="Shape1_2" o:spid="_x0000_s1034" style="position:absolute;margin-left:49.2pt;margin-top:100.35pt;width:141.25pt;height:12.6pt;z-index:251652096;visibility:visible;mso-wrap-style:square;mso-wrap-distance-left:0;mso-wrap-distance-top:0;mso-wrap-distance-right:0;mso-wrap-distance-bottom:0;mso-position-horizontal:absolute;mso-position-horizontal-relative:text;mso-position-vertical:absolute;mso-position-vertical-relative:text;v-text-anchor:top" o:gfxdata="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" filled="f" stroked="f">
+              <v:rect w14:anchorId="6EB58B66" id="Shape1_2" o:spid="_x0000_s1034" style="position:absolute;margin-left:49.2pt;margin-top:100.35pt;width:141.25pt;height:12.6pt;z-index:251651072;visibility:visible;mso-wrap-style:square;mso-wrap-distance-left:0;mso-wrap-distance-top:0;mso-wrap-distance-right:0;mso-wrap-distance-bottom:0;mso-position-horizontal:absolute;mso-position-horizontal-relative:text;mso-position-vertical:absolute;mso-position-vertical-relative:text;v-text-anchor:top" o:gfxdata="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" filled="f" stroked="f">
                 <v:textbox style="mso-fit-shape-to-text:t" inset="0,0,0,0">
                   <w:txbxContent>
                     <w:p>
@@ -919,7 +919,7 @@
         <mc:AlternateContent>
           <mc:Choice Requires="wps">
             <w:drawing>
-              <wp:anchor distT="0" distB="0" distL="0" distR="0" simplePos="0" relativeHeight="251653120" behindDoc="0" locked="0" layoutInCell="1" allowOverlap="1" wp14:anchorId="4BB37351" wp14:editId="3E5BDA12">
+              <wp:anchor distT="0" distB="0" distL="0" distR="0" simplePos="0" relativeHeight="251652096" behindDoc="0" locked="0" layoutInCell="1" allowOverlap="1" wp14:anchorId="4BB37351" wp14:editId="3E5BDA12">
                 <wp:simplePos x="0" y="0"/>
                 <wp:positionH relativeFrom="column">
                   <wp:posOffset>607060</wp:posOffset>
@@ -987,7 +987,7 @@
           </mc:Choice>
           <mc:Fallback>
             <w:pict>
-              <v:rect w14:anchorId="4BB37351" id="Shape1_4" o:spid="_x0000_s1035" style="position:absolute;margin-left:47.8pt;margin-top:122.35pt;width:141.25pt;height:12.6pt;z-index:251653120;visibility:visible;mso-wrap-style:square;mso-wrap-distance-left:0;mso-wrap-distance-top:0;mso-wrap-distance-right:0;mso-wrap-distance-bottom:0;mso-position-horizontal:absolute;mso-position-horizontal-relative:text;mso-position-vertical:absolute;mso-position-vertical-relative:text;v-text-anchor:top" o:gfxdata="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" filled="f" stroked="f">
+              <v:rect w14:anchorId="4BB37351" id="Shape1_4" o:spid="_x0000_s1035" style="position:absolute;margin-left:47.8pt;margin-top:122.35pt;width:141.25pt;height:12.6pt;z-index:251652096;visibility:visible;mso-wrap-style:square;mso-wrap-distance-left:0;mso-wrap-distance-top:0;mso-wrap-distance-right:0;mso-wrap-distance-bottom:0;mso-position-horizontal:absolute;mso-position-horizontal-relative:text;mso-position-vertical:absolute;mso-position-vertical-relative:text;v-text-anchor:top" o:gfxdata="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" filled="f" stroked="f">
                 <v:textbox style="mso-fit-shape-to-text:t" inset="0,0,0,0">
                   <w:txbxContent>
                     <w:p>
@@ -1015,7 +1015,7 @@
         <mc:AlternateContent>
           <mc:Choice Requires="wps">
             <w:drawing>
-              <wp:anchor distT="0" distB="0" distL="0" distR="0" simplePos="0" relativeHeight="251655168" behindDoc="0" locked="0" layoutInCell="1" allowOverlap="1" wp14:anchorId="64C9B0BD" wp14:editId="288E3873">
+              <wp:anchor distT="0" distB="0" distL="0" distR="0" simplePos="0" relativeHeight="251654144" behindDoc="0" locked="0" layoutInCell="1" allowOverlap="1" wp14:anchorId="64C9B0BD" wp14:editId="288E3873">
                 <wp:simplePos x="0" y="0"/>
                 <wp:positionH relativeFrom="column">
                   <wp:posOffset>553085</wp:posOffset>
@@ -1083,7 +1083,7 @@
           </mc:Choice>
           <mc:Fallback>
             <w:pict>
-              <v:rect w14:anchorId="64C9B0BD" id="Shape1_5" o:spid="_x0000_s1036" style="position:absolute;margin-left:43.55pt;margin-top:144.35pt;width:141.25pt;height:12.6pt;z-index:251655168;visibility:visible;mso-wrap-style:square;mso-wrap-distance-left:0;mso-wrap-distance-top:0;mso-wrap-distance-right:0;mso-wrap-distance-bottom:0;mso-position-horizontal:absolute;mso-position-horizontal-relative:text;mso-position-vertical:absolute;mso-position-vertical-relative:text;v-text-anchor:top" o:gfxdata="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" filled="f" stroked="f">
+              <v:rect w14:anchorId="64C9B0BD" id="Shape1_5" o:spid="_x0000_s1036" style="position:absolute;margin-left:43.55pt;margin-top:144.35pt;width:141.25pt;height:12.6pt;z-index:251654144;visibility:visible;mso-wrap-style:square;mso-wrap-distance-left:0;mso-wrap-distance-top:0;mso-wrap-distance-right:0;mso-wrap-distance-bottom:0;mso-position-horizontal:absolute;mso-position-horizontal-relative:text;mso-position-vertical:absolute;mso-position-vertical-relative:text;v-text-anchor:top" o:gfxdata="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" filled="f" stroked="f">
                 <v:textbox style="mso-fit-shape-to-text:t" inset="0,0,0,0">
                   <w:txbxContent>
                     <w:p>
@@ -1355,7 +1355,7 @@
                               <w:rPr>
                                 <w:rFonts w:ascii="Arial" w:hAnsi="Arial"/>
                               </w:rPr>
-                              <w:t>${CITY_HALL}</w:t>
+                              <w:t>${CITY}</w:t>
                             </w:r>
                           </w:p>
                         </w:txbxContent>
@@ -1382,7 +1382,7 @@
                         <w:rPr>
                           <w:rFonts w:ascii="Arial" w:hAnsi="Arial"/>
                         </w:rPr>
-                        <w:t>${CITY_HALL}</w:t>
+                        <w:t>${CITY}</w:t>
                       </w:r>
                     </w:p>
                   </w:txbxContent>
@@ -1399,7 +1399,7 @@
         <mc:AlternateContent>
           <mc:Choice Requires="wps">
             <w:drawing>
-              <wp:anchor distT="0" distB="0" distL="0" distR="0" simplePos="0" relativeHeight="251663360" behindDoc="0" locked="0" layoutInCell="1" allowOverlap="1" wp14:anchorId="10097AE5" wp14:editId="56BC6979">
+              <wp:anchor distT="0" distB="0" distL="0" distR="0" simplePos="0" relativeHeight="251662336" behindDoc="0" locked="0" layoutInCell="1" allowOverlap="1" wp14:anchorId="10097AE5" wp14:editId="56BC6979">
                 <wp:simplePos x="0" y="0"/>
                 <wp:positionH relativeFrom="column">
                   <wp:posOffset>255270</wp:posOffset>
@@ -1467,7 +1467,7 @@
           </mc:Choice>
           <mc:Fallback>
             <w:pict>
-              <v:rect w14:anchorId="10097AE5" id="Shape1_10" o:spid="_x0000_s1040" style="position:absolute;margin-left:20.1pt;margin-top:225.45pt;width:51.65pt;height:12.6pt;z-index:251663360;visibility:visible;mso-wrap-style:square;mso-wrap-distance-left:0;mso-wrap-distance-top:0;mso-wrap-distance-right:0;mso-wrap-distance-bottom:0;mso-position-horizontal:absolute;mso-position-horizontal-relative:text;mso-position-vertical:absolute;mso-position-vertical-relative:text;v-text-anchor:top" o:gfxdata="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" filled="f" stroked="f">
+              <v:rect w14:anchorId="10097AE5" id="Shape1_10" o:spid="_x0000_s1040" style="position:absolute;margin-left:20.1pt;margin-top:225.45pt;width:51.65pt;height:12.6pt;z-index:251662336;visibility:visible;mso-wrap-style:square;mso-wrap-distance-left:0;mso-wrap-distance-top:0;mso-wrap-distance-right:0;mso-wrap-distance-bottom:0;mso-position-horizontal:absolute;mso-position-horizontal-relative:text;mso-position-vertical:absolute;mso-position-vertical-relative:text;v-text-anchor:top" o:gfxdata="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" filled="f" stroked="f">
                 <v:textbox style="mso-fit-shape-to-text:t" inset="0,0,0,0">
                   <w:txbxContent>
                     <w:p>

</xml_diff>